<commit_message>
save larger font for table 1
</commit_message>
<xml_diff>
--- a/analyses/26-visualizations/Table1_experiment_results.docx
+++ b/analyses/26-visualizations/Table1_experiment_results.docx
@@ -63,8 +63,8 @@
                 <w:b w:val="true"/>
                 <w:u w:val="none"/>
                 <w:strike w:val="false"/>
-                <w:sz w:val="22"/>
-                <w:szCs w:val="22"/>
+                <w:sz w:val="28"/>
+                <w:szCs w:val="28"/>
                 <w:color w:val="000000"/>
               </w:rPr>
             </w:pPr>
@@ -75,8 +75,8 @@
                 <w:b w:val="true"/>
                 <w:u w:val="none"/>
                 <w:strike w:val="false"/>
-                <w:sz w:val="22"/>
-                <w:szCs w:val="22"/>
+                <w:sz w:val="28"/>
+                <w:szCs w:val="28"/>
                 <w:color w:val="000000"/>
               </w:rPr>
               <w:t xml:space="preserve">Experiment</w:t>
@@ -118,8 +118,8 @@
                 <w:b w:val="true"/>
                 <w:u w:val="none"/>
                 <w:strike w:val="false"/>
-                <w:sz w:val="22"/>
-                <w:szCs w:val="22"/>
+                <w:sz w:val="28"/>
+                <w:szCs w:val="28"/>
                 <w:color w:val="000000"/>
               </w:rPr>
             </w:pPr>
@@ -130,8 +130,8 @@
                 <w:b w:val="true"/>
                 <w:u w:val="none"/>
                 <w:strike w:val="false"/>
-                <w:sz w:val="22"/>
-                <w:szCs w:val="22"/>
+                <w:sz w:val="28"/>
+                <w:szCs w:val="28"/>
                 <w:color w:val="000000"/>
               </w:rPr>
               <w:t xml:space="preserve">Treatment Groups</w:t>
@@ -173,8 +173,8 @@
                 <w:b w:val="true"/>
                 <w:u w:val="none"/>
                 <w:strike w:val="false"/>
-                <w:sz w:val="22"/>
-                <w:szCs w:val="22"/>
+                <w:sz w:val="28"/>
+                <w:szCs w:val="28"/>
                 <w:color w:val="000000"/>
               </w:rPr>
             </w:pPr>
@@ -185,8 +185,8 @@
                 <w:b w:val="true"/>
                 <w:u w:val="none"/>
                 <w:strike w:val="false"/>
-                <w:sz w:val="22"/>
-                <w:szCs w:val="22"/>
+                <w:sz w:val="28"/>
+                <w:szCs w:val="28"/>
                 <w:color w:val="000000"/>
               </w:rPr>
               <w:t xml:space="preserve">Individuals Per Treatment</w:t>
@@ -228,8 +228,8 @@
                 <w:b w:val="true"/>
                 <w:u w:val="none"/>
                 <w:strike w:val="false"/>
-                <w:sz w:val="22"/>
-                <w:szCs w:val="22"/>
+                <w:sz w:val="28"/>
+                <w:szCs w:val="28"/>
                 <w:color w:val="000000"/>
               </w:rPr>
             </w:pPr>
@@ -240,8 +240,8 @@
                 <w:b w:val="true"/>
                 <w:u w:val="none"/>
                 <w:strike w:val="false"/>
-                <w:sz w:val="22"/>
-                <w:szCs w:val="22"/>
+                <w:sz w:val="28"/>
+                <w:szCs w:val="28"/>
                 <w:color w:val="000000"/>
               </w:rPr>
               <w:t xml:space="preserve">Proportion Mortality</w:t>
@@ -283,8 +283,8 @@
                 <w:b w:val="true"/>
                 <w:u w:val="none"/>
                 <w:strike w:val="false"/>
-                <w:sz w:val="22"/>
-                <w:szCs w:val="22"/>
+                <w:sz w:val="28"/>
+                <w:szCs w:val="28"/>
                 <w:color w:val="000000"/>
               </w:rPr>
             </w:pPr>
@@ -295,8 +295,8 @@
                 <w:b w:val="true"/>
                 <w:u w:val="none"/>
                 <w:strike w:val="false"/>
-                <w:sz w:val="22"/>
-                <w:szCs w:val="22"/>
+                <w:sz w:val="28"/>
+                <w:szCs w:val="28"/>
                 <w:color w:val="000000"/>
               </w:rPr>
               <w:t xml:space="preserve">Number of Individuals Sequenced with RNASeq</w:t>
@@ -344,8 +344,8 @@
                 <w:b w:val="false"/>
                 <w:u w:val="none"/>
                 <w:strike w:val="false"/>
-                <w:sz w:val="22"/>
-                <w:szCs w:val="22"/>
+                <w:sz w:val="28"/>
+                <w:szCs w:val="28"/>
                 <w:color w:val="000000"/>
               </w:rPr>
             </w:pPr>
@@ -356,8 +356,8 @@
                 <w:b w:val="false"/>
                 <w:u w:val="none"/>
                 <w:strike w:val="false"/>
-                <w:sz w:val="22"/>
-                <w:szCs w:val="22"/>
+                <w:sz w:val="28"/>
+                <w:szCs w:val="28"/>
                 <w:color w:val="000000"/>
               </w:rPr>
               <w:t xml:space="preserve">Adult SSWD Challenge</w:t>
@@ -399,8 +399,8 @@
                 <w:b w:val="false"/>
                 <w:u w:val="none"/>
                 <w:strike w:val="false"/>
-                <w:sz w:val="22"/>
-                <w:szCs w:val="22"/>
+                <w:sz w:val="28"/>
+                <w:szCs w:val="28"/>
                 <w:color w:val="000000"/>
               </w:rPr>
             </w:pPr>
@@ -411,8 +411,8 @@
                 <w:b w:val="false"/>
                 <w:u w:val="none"/>
                 <w:strike w:val="false"/>
-                <w:sz w:val="22"/>
-                <w:szCs w:val="22"/>
+                <w:sz w:val="28"/>
+                <w:szCs w:val="28"/>
                 <w:color w:val="000000"/>
               </w:rPr>
               <w:t xml:space="preserve">Exposed</w:t>
@@ -454,8 +454,8 @@
                 <w:b w:val="false"/>
                 <w:u w:val="none"/>
                 <w:strike w:val="false"/>
-                <w:sz w:val="22"/>
-                <w:szCs w:val="22"/>
+                <w:sz w:val="28"/>
+                <w:szCs w:val="28"/>
                 <w:color w:val="000000"/>
               </w:rPr>
             </w:pPr>
@@ -466,8 +466,8 @@
                 <w:b w:val="false"/>
                 <w:u w:val="none"/>
                 <w:strike w:val="false"/>
-                <w:sz w:val="22"/>
-                <w:szCs w:val="22"/>
+                <w:sz w:val="28"/>
+                <w:szCs w:val="28"/>
                 <w:color w:val="000000"/>
               </w:rPr>
               <w:t xml:space="preserve">8</w:t>
@@ -509,8 +509,8 @@
                 <w:b w:val="false"/>
                 <w:u w:val="none"/>
                 <w:strike w:val="false"/>
-                <w:sz w:val="22"/>
-                <w:szCs w:val="22"/>
+                <w:sz w:val="28"/>
+                <w:szCs w:val="28"/>
                 <w:color w:val="000000"/>
               </w:rPr>
             </w:pPr>
@@ -521,8 +521,8 @@
                 <w:b w:val="false"/>
                 <w:u w:val="none"/>
                 <w:strike w:val="false"/>
-                <w:sz w:val="22"/>
-                <w:szCs w:val="22"/>
+                <w:sz w:val="28"/>
+                <w:szCs w:val="28"/>
                 <w:color w:val="000000"/>
               </w:rPr>
               <w:t xml:space="preserve">0.75</w:t>
@@ -564,8 +564,8 @@
                 <w:b w:val="false"/>
                 <w:u w:val="none"/>
                 <w:strike w:val="false"/>
-                <w:sz w:val="22"/>
-                <w:szCs w:val="22"/>
+                <w:sz w:val="28"/>
+                <w:szCs w:val="28"/>
                 <w:color w:val="000000"/>
               </w:rPr>
             </w:pPr>
@@ -576,8 +576,8 @@
                 <w:b w:val="false"/>
                 <w:u w:val="none"/>
                 <w:strike w:val="false"/>
-                <w:sz w:val="22"/>
-                <w:szCs w:val="22"/>
+                <w:sz w:val="28"/>
+                <w:szCs w:val="28"/>
                 <w:color w:val="000000"/>
               </w:rPr>
               <w:t xml:space="preserve">8</w:t>
@@ -625,8 +625,8 @@
                 <w:b w:val="false"/>
                 <w:u w:val="none"/>
                 <w:strike w:val="false"/>
-                <w:sz w:val="22"/>
-                <w:szCs w:val="22"/>
+                <w:sz w:val="28"/>
+                <w:szCs w:val="28"/>
                 <w:color w:val="000000"/>
               </w:rPr>
             </w:pPr>
@@ -667,8 +667,8 @@
                 <w:b w:val="false"/>
                 <w:u w:val="none"/>
                 <w:strike w:val="false"/>
-                <w:sz w:val="22"/>
-                <w:szCs w:val="22"/>
+                <w:sz w:val="28"/>
+                <w:szCs w:val="28"/>
                 <w:color w:val="000000"/>
               </w:rPr>
             </w:pPr>
@@ -679,8 +679,8 @@
                 <w:b w:val="false"/>
                 <w:u w:val="none"/>
                 <w:strike w:val="false"/>
-                <w:sz w:val="22"/>
-                <w:szCs w:val="22"/>
+                <w:sz w:val="28"/>
+                <w:szCs w:val="28"/>
                 <w:color w:val="000000"/>
               </w:rPr>
               <w:t xml:space="preserve">Control</w:t>
@@ -722,8 +722,8 @@
                 <w:b w:val="false"/>
                 <w:u w:val="none"/>
                 <w:strike w:val="false"/>
-                <w:sz w:val="22"/>
-                <w:szCs w:val="22"/>
+                <w:sz w:val="28"/>
+                <w:szCs w:val="28"/>
                 <w:color w:val="000000"/>
               </w:rPr>
             </w:pPr>
@@ -734,8 +734,8 @@
                 <w:b w:val="false"/>
                 <w:u w:val="none"/>
                 <w:strike w:val="false"/>
-                <w:sz w:val="22"/>
-                <w:szCs w:val="22"/>
+                <w:sz w:val="28"/>
+                <w:szCs w:val="28"/>
                 <w:color w:val="000000"/>
               </w:rPr>
               <w:t xml:space="preserve">8</w:t>
@@ -777,8 +777,8 @@
                 <w:b w:val="false"/>
                 <w:u w:val="none"/>
                 <w:strike w:val="false"/>
-                <w:sz w:val="22"/>
-                <w:szCs w:val="22"/>
+                <w:sz w:val="28"/>
+                <w:szCs w:val="28"/>
                 <w:color w:val="000000"/>
               </w:rPr>
             </w:pPr>
@@ -789,8 +789,8 @@
                 <w:b w:val="false"/>
                 <w:u w:val="none"/>
                 <w:strike w:val="false"/>
-                <w:sz w:val="22"/>
-                <w:szCs w:val="22"/>
+                <w:sz w:val="28"/>
+                <w:szCs w:val="28"/>
                 <w:color w:val="000000"/>
               </w:rPr>
               <w:t xml:space="preserve">0</w:t>
@@ -832,8 +832,8 @@
                 <w:b w:val="false"/>
                 <w:u w:val="none"/>
                 <w:strike w:val="false"/>
-                <w:sz w:val="22"/>
-                <w:szCs w:val="22"/>
+                <w:sz w:val="28"/>
+                <w:szCs w:val="28"/>
                 <w:color w:val="000000"/>
               </w:rPr>
             </w:pPr>
@@ -844,8 +844,8 @@
                 <w:b w:val="false"/>
                 <w:u w:val="none"/>
                 <w:strike w:val="false"/>
-                <w:sz w:val="22"/>
-                <w:szCs w:val="22"/>
+                <w:sz w:val="28"/>
+                <w:szCs w:val="28"/>
                 <w:color w:val="000000"/>
               </w:rPr>
               <w:t xml:space="preserve">8</w:t>
@@ -893,8 +893,8 @@
                 <w:b w:val="false"/>
                 <w:u w:val="none"/>
                 <w:strike w:val="false"/>
-                <w:sz w:val="22"/>
-                <w:szCs w:val="22"/>
+                <w:sz w:val="28"/>
+                <w:szCs w:val="28"/>
                 <w:color w:val="000000"/>
               </w:rPr>
             </w:pPr>
@@ -905,8 +905,8 @@
                 <w:b w:val="false"/>
                 <w:u w:val="none"/>
                 <w:strike w:val="false"/>
-                <w:sz w:val="22"/>
-                <w:szCs w:val="22"/>
+                <w:sz w:val="28"/>
+                <w:szCs w:val="28"/>
                 <w:color w:val="000000"/>
               </w:rPr>
               <w:t xml:space="preserve">Age Class SSWD Challenge</w:t>
@@ -948,8 +948,8 @@
                 <w:b w:val="false"/>
                 <w:u w:val="none"/>
                 <w:strike w:val="false"/>
-                <w:sz w:val="22"/>
-                <w:szCs w:val="22"/>
+                <w:sz w:val="28"/>
+                <w:szCs w:val="28"/>
                 <w:color w:val="000000"/>
               </w:rPr>
             </w:pPr>
@@ -960,8 +960,8 @@
                 <w:b w:val="false"/>
                 <w:u w:val="none"/>
                 <w:strike w:val="false"/>
-                <w:sz w:val="22"/>
-                <w:szCs w:val="22"/>
+                <w:sz w:val="28"/>
+                <w:szCs w:val="28"/>
                 <w:color w:val="000000"/>
               </w:rPr>
               <w:t xml:space="preserve">Adult Exposed</w:t>
@@ -1003,8 +1003,8 @@
                 <w:b w:val="false"/>
                 <w:u w:val="none"/>
                 <w:strike w:val="false"/>
-                <w:sz w:val="22"/>
-                <w:szCs w:val="22"/>
+                <w:sz w:val="28"/>
+                <w:szCs w:val="28"/>
                 <w:color w:val="000000"/>
               </w:rPr>
             </w:pPr>
@@ -1015,8 +1015,8 @@
                 <w:b w:val="false"/>
                 <w:u w:val="none"/>
                 <w:strike w:val="false"/>
-                <w:sz w:val="22"/>
-                <w:szCs w:val="22"/>
+                <w:sz w:val="28"/>
+                <w:szCs w:val="28"/>
                 <w:color w:val="000000"/>
               </w:rPr>
               <w:t xml:space="preserve">9</w:t>
@@ -1058,8 +1058,8 @@
                 <w:b w:val="false"/>
                 <w:u w:val="none"/>
                 <w:strike w:val="false"/>
-                <w:sz w:val="22"/>
-                <w:szCs w:val="22"/>
+                <w:sz w:val="28"/>
+                <w:szCs w:val="28"/>
                 <w:color w:val="000000"/>
               </w:rPr>
             </w:pPr>
@@ -1070,8 +1070,8 @@
                 <w:b w:val="false"/>
                 <w:u w:val="none"/>
                 <w:strike w:val="false"/>
-                <w:sz w:val="22"/>
-                <w:szCs w:val="22"/>
+                <w:sz w:val="28"/>
+                <w:szCs w:val="28"/>
                 <w:color w:val="000000"/>
               </w:rPr>
               <w:t xml:space="preserve">1</w:t>
@@ -1113,8 +1113,8 @@
                 <w:b w:val="false"/>
                 <w:u w:val="none"/>
                 <w:strike w:val="false"/>
-                <w:sz w:val="22"/>
-                <w:szCs w:val="22"/>
+                <w:sz w:val="28"/>
+                <w:szCs w:val="28"/>
                 <w:color w:val="000000"/>
               </w:rPr>
             </w:pPr>
@@ -1125,8 +1125,8 @@
                 <w:b w:val="false"/>
                 <w:u w:val="none"/>
                 <w:strike w:val="false"/>
-                <w:sz w:val="22"/>
-                <w:szCs w:val="22"/>
+                <w:sz w:val="28"/>
+                <w:szCs w:val="28"/>
                 <w:color w:val="000000"/>
               </w:rPr>
               <w:t xml:space="preserve">3</w:t>
@@ -1174,8 +1174,8 @@
                 <w:b w:val="false"/>
                 <w:u w:val="none"/>
                 <w:strike w:val="false"/>
-                <w:sz w:val="22"/>
-                <w:szCs w:val="22"/>
+                <w:sz w:val="28"/>
+                <w:szCs w:val="28"/>
                 <w:color w:val="000000"/>
               </w:rPr>
             </w:pPr>
@@ -1216,8 +1216,8 @@
                 <w:b w:val="false"/>
                 <w:u w:val="none"/>
                 <w:strike w:val="false"/>
-                <w:sz w:val="22"/>
-                <w:szCs w:val="22"/>
+                <w:sz w:val="28"/>
+                <w:szCs w:val="28"/>
                 <w:color w:val="000000"/>
               </w:rPr>
             </w:pPr>
@@ -1228,8 +1228,8 @@
                 <w:b w:val="false"/>
                 <w:u w:val="none"/>
                 <w:strike w:val="false"/>
-                <w:sz w:val="22"/>
-                <w:szCs w:val="22"/>
+                <w:sz w:val="28"/>
+                <w:szCs w:val="28"/>
                 <w:color w:val="000000"/>
               </w:rPr>
               <w:t xml:space="preserve">Juvenile Exposed</w:t>
@@ -1271,8 +1271,8 @@
                 <w:b w:val="false"/>
                 <w:u w:val="none"/>
                 <w:strike w:val="false"/>
-                <w:sz w:val="22"/>
-                <w:szCs w:val="22"/>
+                <w:sz w:val="28"/>
+                <w:szCs w:val="28"/>
                 <w:color w:val="000000"/>
               </w:rPr>
             </w:pPr>
@@ -1283,8 +1283,8 @@
                 <w:b w:val="false"/>
                 <w:u w:val="none"/>
                 <w:strike w:val="false"/>
-                <w:sz w:val="22"/>
-                <w:szCs w:val="22"/>
+                <w:sz w:val="28"/>
+                <w:szCs w:val="28"/>
                 <w:color w:val="000000"/>
               </w:rPr>
               <w:t xml:space="preserve">10</w:t>
@@ -1326,8 +1326,8 @@
                 <w:b w:val="false"/>
                 <w:u w:val="none"/>
                 <w:strike w:val="false"/>
-                <w:sz w:val="22"/>
-                <w:szCs w:val="22"/>
+                <w:sz w:val="28"/>
+                <w:szCs w:val="28"/>
                 <w:color w:val="000000"/>
               </w:rPr>
             </w:pPr>
@@ -1338,8 +1338,8 @@
                 <w:b w:val="false"/>
                 <w:u w:val="none"/>
                 <w:strike w:val="false"/>
-                <w:sz w:val="22"/>
-                <w:szCs w:val="22"/>
+                <w:sz w:val="28"/>
+                <w:szCs w:val="28"/>
                 <w:color w:val="000000"/>
               </w:rPr>
               <w:t xml:space="preserve">1</w:t>
@@ -1381,8 +1381,8 @@
                 <w:b w:val="false"/>
                 <w:u w:val="none"/>
                 <w:strike w:val="false"/>
-                <w:sz w:val="22"/>
-                <w:szCs w:val="22"/>
+                <w:sz w:val="28"/>
+                <w:szCs w:val="28"/>
                 <w:color w:val="000000"/>
               </w:rPr>
             </w:pPr>
@@ -1393,8 +1393,8 @@
                 <w:b w:val="false"/>
                 <w:u w:val="none"/>
                 <w:strike w:val="false"/>
-                <w:sz w:val="22"/>
-                <w:szCs w:val="22"/>
+                <w:sz w:val="28"/>
+                <w:szCs w:val="28"/>
                 <w:color w:val="000000"/>
               </w:rPr>
               <w:t xml:space="preserve">3</w:t>
@@ -1442,8 +1442,8 @@
                 <w:b w:val="false"/>
                 <w:u w:val="none"/>
                 <w:strike w:val="false"/>
-                <w:sz w:val="22"/>
-                <w:szCs w:val="22"/>
+                <w:sz w:val="28"/>
+                <w:szCs w:val="28"/>
                 <w:color w:val="000000"/>
               </w:rPr>
             </w:pPr>
@@ -1484,8 +1484,8 @@
                 <w:b w:val="false"/>
                 <w:u w:val="none"/>
                 <w:strike w:val="false"/>
-                <w:sz w:val="22"/>
-                <w:szCs w:val="22"/>
+                <w:sz w:val="28"/>
+                <w:szCs w:val="28"/>
                 <w:color w:val="000000"/>
               </w:rPr>
             </w:pPr>
@@ -1496,8 +1496,8 @@
                 <w:b w:val="false"/>
                 <w:u w:val="none"/>
                 <w:strike w:val="false"/>
-                <w:sz w:val="22"/>
-                <w:szCs w:val="22"/>
+                <w:sz w:val="28"/>
+                <w:szCs w:val="28"/>
                 <w:color w:val="000000"/>
               </w:rPr>
               <w:t xml:space="preserve">Adult Control</w:t>
@@ -1539,8 +1539,8 @@
                 <w:b w:val="false"/>
                 <w:u w:val="none"/>
                 <w:strike w:val="false"/>
-                <w:sz w:val="22"/>
-                <w:szCs w:val="22"/>
+                <w:sz w:val="28"/>
+                <w:szCs w:val="28"/>
                 <w:color w:val="000000"/>
               </w:rPr>
             </w:pPr>
@@ -1551,8 +1551,8 @@
                 <w:b w:val="false"/>
                 <w:u w:val="none"/>
                 <w:strike w:val="false"/>
-                <w:sz w:val="22"/>
-                <w:szCs w:val="22"/>
+                <w:sz w:val="28"/>
+                <w:szCs w:val="28"/>
                 <w:color w:val="000000"/>
               </w:rPr>
               <w:t xml:space="preserve">15</w:t>
@@ -1594,8 +1594,8 @@
                 <w:b w:val="false"/>
                 <w:u w:val="none"/>
                 <w:strike w:val="false"/>
-                <w:sz w:val="22"/>
-                <w:szCs w:val="22"/>
+                <w:sz w:val="28"/>
+                <w:szCs w:val="28"/>
                 <w:color w:val="000000"/>
               </w:rPr>
             </w:pPr>
@@ -1606,8 +1606,8 @@
                 <w:b w:val="false"/>
                 <w:u w:val="none"/>
                 <w:strike w:val="false"/>
-                <w:sz w:val="22"/>
-                <w:szCs w:val="22"/>
+                <w:sz w:val="28"/>
+                <w:szCs w:val="28"/>
                 <w:color w:val="000000"/>
               </w:rPr>
               <w:t xml:space="preserve">0</w:t>
@@ -1649,8 +1649,8 @@
                 <w:b w:val="false"/>
                 <w:u w:val="none"/>
                 <w:strike w:val="false"/>
-                <w:sz w:val="22"/>
-                <w:szCs w:val="22"/>
+                <w:sz w:val="28"/>
+                <w:szCs w:val="28"/>
                 <w:color w:val="000000"/>
               </w:rPr>
             </w:pPr>
@@ -1661,8 +1661,8 @@
                 <w:b w:val="false"/>
                 <w:u w:val="none"/>
                 <w:strike w:val="false"/>
-                <w:sz w:val="22"/>
-                <w:szCs w:val="22"/>
+                <w:sz w:val="28"/>
+                <w:szCs w:val="28"/>
                 <w:color w:val="000000"/>
               </w:rPr>
               <w:t xml:space="preserve">3</w:t>
@@ -1710,8 +1710,8 @@
                 <w:b w:val="false"/>
                 <w:u w:val="none"/>
                 <w:strike w:val="false"/>
-                <w:sz w:val="22"/>
-                <w:szCs w:val="22"/>
+                <w:sz w:val="28"/>
+                <w:szCs w:val="28"/>
                 <w:color w:val="000000"/>
               </w:rPr>
             </w:pPr>
@@ -1752,8 +1752,8 @@
                 <w:b w:val="false"/>
                 <w:u w:val="none"/>
                 <w:strike w:val="false"/>
-                <w:sz w:val="22"/>
-                <w:szCs w:val="22"/>
+                <w:sz w:val="28"/>
+                <w:szCs w:val="28"/>
                 <w:color w:val="000000"/>
               </w:rPr>
             </w:pPr>
@@ -1764,8 +1764,8 @@
                 <w:b w:val="false"/>
                 <w:u w:val="none"/>
                 <w:strike w:val="false"/>
-                <w:sz w:val="22"/>
-                <w:szCs w:val="22"/>
+                <w:sz w:val="28"/>
+                <w:szCs w:val="28"/>
                 <w:color w:val="000000"/>
               </w:rPr>
               <w:t xml:space="preserve">Juvenile Control</w:t>
@@ -1807,8 +1807,8 @@
                 <w:b w:val="false"/>
                 <w:u w:val="none"/>
                 <w:strike w:val="false"/>
-                <w:sz w:val="22"/>
-                <w:szCs w:val="22"/>
+                <w:sz w:val="28"/>
+                <w:szCs w:val="28"/>
                 <w:color w:val="000000"/>
               </w:rPr>
             </w:pPr>
@@ -1819,8 +1819,8 @@
                 <w:b w:val="false"/>
                 <w:u w:val="none"/>
                 <w:strike w:val="false"/>
-                <w:sz w:val="22"/>
-                <w:szCs w:val="22"/>
+                <w:sz w:val="28"/>
+                <w:szCs w:val="28"/>
                 <w:color w:val="000000"/>
               </w:rPr>
               <w:t xml:space="preserve">15</w:t>
@@ -1862,8 +1862,8 @@
                 <w:b w:val="false"/>
                 <w:u w:val="none"/>
                 <w:strike w:val="false"/>
-                <w:sz w:val="22"/>
-                <w:szCs w:val="22"/>
+                <w:sz w:val="28"/>
+                <w:szCs w:val="28"/>
                 <w:color w:val="000000"/>
               </w:rPr>
             </w:pPr>
@@ -1874,8 +1874,8 @@
                 <w:b w:val="false"/>
                 <w:u w:val="none"/>
                 <w:strike w:val="false"/>
-                <w:sz w:val="22"/>
-                <w:szCs w:val="22"/>
+                <w:sz w:val="28"/>
+                <w:szCs w:val="28"/>
                 <w:color w:val="000000"/>
               </w:rPr>
               <w:t xml:space="preserve">0</w:t>
@@ -1917,8 +1917,8 @@
                 <w:b w:val="false"/>
                 <w:u w:val="none"/>
                 <w:strike w:val="false"/>
-                <w:sz w:val="22"/>
-                <w:szCs w:val="22"/>
+                <w:sz w:val="28"/>
+                <w:szCs w:val="28"/>
                 <w:color w:val="000000"/>
               </w:rPr>
             </w:pPr>
@@ -1929,8 +1929,8 @@
                 <w:b w:val="false"/>
                 <w:u w:val="none"/>
                 <w:strike w:val="false"/>
-                <w:sz w:val="22"/>
-                <w:szCs w:val="22"/>
+                <w:sz w:val="28"/>
+                <w:szCs w:val="28"/>
                 <w:color w:val="000000"/>
               </w:rPr>
               <w:t xml:space="preserve">3</w:t>

</xml_diff>